<commit_message>
update sync after review
</commit_message>
<xml_diff>
--- a/Docs/Capstone_Project/02_Stage_Workbooks/Stage_2_PRD_Template.docx
+++ b/Docs/Capstone_Project/02_Stage_Workbooks/Stage_2_PRD_Template.docx
@@ -354,7 +354,7 @@
               <w:rPr>
                 <w:sz w:val="18"/>
               </w:rPr>
-              <w:t>1.0</w:t>
+              <w:t>2.0 (v1.0 dated 07/09/26; revised after the build and the validation run; every change and its trigger is in the Stage 5 revision log)</w:t>
             </w:r>
           </w:p>
         </w:tc>
@@ -448,7 +448,7 @@
               <w:spacing w:before="50" w:after="50"/>
             </w:pPr>
             <w:r>
-              <w:t>07/09/26</w:t>
+              <w:t>17/09/26</w:t>
             </w:r>
           </w:p>
         </w:tc>
@@ -499,7 +499,7 @@
               <w:rPr>
                 <w:sz w:val="18"/>
               </w:rPr>
-              <w:t>Draft for review</w:t>
+              <w:t>Revised after build</w:t>
             </w:r>
           </w:p>
         </w:tc>
@@ -1820,7 +1820,7 @@
               <w:spacing w:before="50" w:after="50"/>
             </w:pPr>
             <w:r>
-              <w:t>The system shall assign an intent (one of the 22 classes) and an urgency (high/medium/low) to every ticket, with a confidence between 0 and 1, and record the alternatives considered.</w:t>
+              <w:t>The system shall assign an intent (one of the 22 classes) and an urgency to every ticket with a calibrated confidence between 0 and 1, and record the alternatives considered. The intent is the weighted vote of the 7 nearest labelled development tickets (same embedder as retrieval); the language model supplies the instruction-like flag and the reason, and its intent is recorded as the first alternative when it disagrees. When the model fails, the reason reads "classification failed: provider unavailable" and the neighbours' intent is kept, so outages are not counted as unclear_request.</w:t>
             </w:r>
           </w:p>
         </w:tc>
@@ -2031,7 +2031,7 @@
               <w:spacing w:before="50" w:after="50"/>
             </w:pPr>
             <w:r>
-              <w:t>The system shall return no passages, rather than irrelevant ones, when nothing in the corpus meets the relevance threshold.</w:t>
+              <w:t>The system shall apply a relevance threshold (0.40 cosine, derived from development data) that removes off-topic passages and returns nothing rather than irrelevant text. The threshold does not detect non-answerable tickets; that is the router's job (never-auto intents and the confidence threshold, FR-05 and FR-06).</w:t>
             </w:r>
           </w:p>
         </w:tc>
@@ -2352,7 +2352,7 @@
               <w:spacing w:before="50" w:after="50"/>
             </w:pPr>
             <w:r>
-              <w:t>The system shall draft an answer only from the retrieved passages, with a citation on each factual claim, and say plainly when it does not know.</w:t>
+              <w:t>The system shall draft an answer only from the retrieved passages and say plainly when it does not know. Every factual sentence of the draft is verified against a retrieved passage (sentence cosine &gt;= 0.50 or lexical containment &gt;= 0.50, and NLI contradiction &lt; 0.85); supported sentences carry the citation, attached by code where the model omitted it; an unverifiable sentence blocks the draft (FR-10).</w:t>
             </w:r>
           </w:p>
         </w:tc>
@@ -2665,7 +2665,7 @@
               <w:spacing w:before="50" w:after="50"/>
             </w:pPr>
             <w:r>
-              <w:t>The system shall block any draft that makes a claim unsupported by the retrieved passages, or that states a refund has been issued, the issue is fixed on CloudServe's side, or a delivery date.</w:t>
+              <w:t>The system shall block any draft that contains a factual sentence not supported by the retrieved passages or contradicted by them (NLI check), or that states a refund has been issued, the issue is fixed on CloudServe's side, or a delivery date. Headings, symptom and cause lines of the articles, and courtesy or narration sentences are not claims. Blocked drafts travel to the engineer inside the escalation package; an expected false-block rate of 2 to 3% of tickets is accepted.</w:t>
             </w:r>
           </w:p>
         </w:tc>
@@ -2825,7 +2825,7 @@
               <w:spacing w:before="50" w:after="50"/>
             </w:pPr>
             <w:r>
-              <w:t>Logged decisions reconcile exactly with tickets processed, including failures.</w:t>
+              <w:t>Logged decisions reconcile exactly with tickets processed, including failures: the harness reconciles after every run and writes the result into metrics.json and run_summary.md, and writes routing and validation rows itself when a component raises (500/500 development, 80/80 validation).</w:t>
             </w:r>
           </w:p>
         </w:tc>
@@ -3304,7 +3304,7 @@
               <w:spacing w:before="50" w:after="50"/>
             </w:pPr>
             <w:r>
-              <w:t>The system shall order or flag tickets by predicted urgency so high-urgency tickets are not left behind older low-urgency ones.</w:t>
+              <w:t>The system shall flag every ticket with a predicted urgency and offer ordering by it in the batch output (--sort-urgency). The flag is advisory: predicted urgency is near the majority baseline (0.49 against 0.45 on development data) and must not be used for SLA decisions.</w:t>
             </w:r>
           </w:p>
         </w:tc>
@@ -3470,6 +3470,58 @@
             </w:pPr>
             <w:r>
               <w:t>Covered by FR-04, FR-06 and the corpus being the 29 articles only.</w:t>
+            </w:r>
+          </w:p>
+        </w:tc>
+      </w:tr>
+      <w:tr>
+        <w:tc>
+          <w:tcPr>
+            <w:tcW w:type="dxa" w:w="792"/>
+          </w:tcPr>
+          <w:p>
+            <w:r>
+              <w:t>FR-18</w:t>
+            </w:r>
+          </w:p>
+        </w:tc>
+        <w:tc>
+          <w:tcPr>
+            <w:tcW w:type="dxa" w:w="3024"/>
+          </w:tcPr>
+          <w:p>
+            <w:r>
+              <w:t>The system shall expose a single-ticket API endpoint (POST /tickets) that accepts one ticket in the dataset schema and returns the decision, the draft with citations or the escalation package, and the guardrail verdicts; with GET /decisions/{ticket_id} for the log rows and GET /health for the kill-switch state.</w:t>
+            </w:r>
+          </w:p>
+        </w:tc>
+        <w:tc>
+          <w:tcPr>
+            <w:tcW w:type="dxa" w:w="936"/>
+          </w:tcPr>
+          <w:p>
+            <w:r>
+              <w:t>Must</w:t>
+            </w:r>
+          </w:p>
+        </w:tc>
+        <w:tc>
+          <w:tcPr>
+            <w:tcW w:type="dxa" w:w="1872"/>
+          </w:tcPr>
+          <w:p>
+            <w:r>
+              <w:t>Build Specification section 06 steps 5 to 7 (graders submit one ticket per channel and a guardrail trigger by hand); Stage 5 revision log</w:t>
+            </w:r>
+          </w:p>
+        </w:tc>
+        <w:tc>
+          <w:tcPr>
+            <w:tcW w:type="dxa" w:w="3024"/>
+          </w:tcPr>
+          <w:p>
+            <w:r>
+              <w:t>One ticket per channel and a guardrail-trigger ticket submitted by hand return a decision without error; a malformed body returns an escalation, not a crash. Verified in the clean-clone rehearsal, 16/09/26.</w:t>
             </w:r>
           </w:p>
         </w:tc>
@@ -3701,7 +3753,7 @@
               <w:spacing w:before="50" w:after="50"/>
             </w:pPr>
             <w:r>
-              <w:t>95th percentile end-to-end time per ticket under 3s (chat customers abandon; Ravi).</w:t>
+              <w:t>95th percentile time per ticket under 3 s for the local pipeline (measured 0.53 s with cached provider replies). Provider round trips are reported separately (validation p95 13.7 s; live development run p95 16.8 s); the 3 s end-to-end figure is recorded as not achievable with a remote free-tier model making 2 to 3 calls per ticket.</w:t>
             </w:r>
           </w:p>
         </w:tc>
@@ -3723,7 +3775,7 @@
               <w:spacing w:before="50" w:after="50"/>
             </w:pPr>
             <w:r>
-              <w:t>Harness timing on the validation run.</w:t>
+              <w:t>Harness timing on the validation run, reported as median and p95, split into local pipeline and provider time.</w:t>
             </w:r>
           </w:p>
         </w:tc>
@@ -4150,7 +4202,7 @@
               <w:spacing w:before="50" w:after="50"/>
             </w:pPr>
             <w:r>
-              <w:t>Under 5 percentage points variation in resolution quality across fluency, tier and region.</w:t>
+              <w:t>Under 5 percentage points variation in resolution quality across fluency, tier, region, ticket length and channel, judged with 95% Wilson intervals; a point gap whose intervals overlap the best segment is reported, not treated as a finding.</w:t>
             </w:r>
           </w:p>
         </w:tc>
@@ -4170,7 +4222,7 @@
               <w:spacing w:before="50" w:after="50"/>
             </w:pPr>
             <w:r>
-              <w:t>Segmented metrics from the harness, compared with the human baseline in Stage 1 Section 2 rows 9, 10.</w:t>
+              <w:t>python -m evaluation.fairness_audit over the validation and development runs; table in Docs/governance.md section 3.</w:t>
             </w:r>
           </w:p>
         </w:tc>
@@ -4238,7 +4290,7 @@
               <w:spacing w:before="50" w:after="50"/>
             </w:pPr>
             <w:r>
-              <w:t>Free tier only; responses cached; rate limits handled with backoff.</w:t>
+              <w:t>The paid llama-3.1-8b endpoint on OpenRouter at about $0.03 per 500 tickets (the free variant is capped at 50 requests a day and cannot complete a run); replies cached on disk; 20 requests per minute pacing with backoff; project total under $0.25.</w:t>
             </w:r>
           </w:p>
         </w:tc>
@@ -4257,7 +4309,7 @@
               <w:spacing w:before="50" w:after="50"/>
             </w:pPr>
             <w:r>
-              <w:t>Full run completes within the free allowance; no paid calls.</w:t>
+              <w:t>Provider spend shown on the key's usage page after each run; cache hit rate visible in run duration.</w:t>
             </w:r>
           </w:p>
         </w:tc>
@@ -4322,7 +4374,7 @@
               <w:spacing w:before="50" w:after="50"/>
             </w:pPr>
             <w:r>
-              <w:t>Stated confidence within 5 points of observed accuracy per band.</w:t>
+              <w:t>Stated confidence within 5 points of observed accuracy in every band with at least 20 tickets; smaller bands are reported but not judged.</w:t>
             </w:r>
           </w:p>
         </w:tc>
@@ -4342,7 +4394,7 @@
               <w:spacing w:before="50" w:after="50"/>
             </w:pPr>
             <w:r>
-              <w:t>Calibration table from the Evaluation Framework.</w:t>
+              <w:t>Calibration table in metrics.json (governance.calibration) on every run; ECE 0.005 development, 0.013 validation.</w:t>
             </w:r>
           </w:p>
         </w:tc>
@@ -7576,6 +7628,9 @@
             <w:pPr>
               <w:spacing w:before="50" w:after="50"/>
             </w:pPr>
+            <w:r>
+              <w:t>Anshul Ghogre, to ask Marcus Adeyemi</w:t>
+            </w:r>
           </w:p>
         </w:tc>
         <w:tc>
@@ -7593,6 +7648,9 @@
               <w:spacing w:before="50" w:after="50"/>
               <w:jc w:val="center"/>
             </w:pPr>
+            <w:r>
+              <w:t>Before a pilot; open at submission (20/09/26). Resolution time is the proxy until then.</w:t>
+            </w:r>
           </w:p>
         </w:tc>
       </w:tr>
@@ -7655,6 +7713,9 @@
             <w:pPr>
               <w:spacing w:before="50" w:after="50"/>
             </w:pPr>
+            <w:r>
+              <w:t>Anshul Ghogre, to ask Daniel Okonkwo</w:t>
+            </w:r>
           </w:p>
         </w:tc>
         <w:tc>
@@ -7672,6 +7733,9 @@
             <w:pPr>
               <w:spacing w:before="50" w:after="50"/>
             </w:pPr>
+            <w:r>
+              <w:t>Before a pilot; open at submission. Labels' policy kept; tone guardrail covers the commitment risk.</w:t>
+            </w:r>
           </w:p>
         </w:tc>
       </w:tr>
@@ -7731,6 +7795,9 @@
             <w:pPr>
               <w:spacing w:before="50" w:after="50"/>
             </w:pPr>
+            <w:r>
+              <w:t>Anshul Ghogre, to ask Marcus Adeyemi</w:t>
+            </w:r>
           </w:p>
         </w:tc>
         <w:tc>
@@ -7747,6 +7814,9 @@
             <w:pPr>
               <w:spacing w:before="50" w:after="50"/>
             </w:pPr>
+            <w:r>
+              <w:t>Before a pilot; open at submission. Fairness audit reports tier segments meanwhile.</w:t>
+            </w:r>
           </w:p>
         </w:tc>
       </w:tr>
@@ -7809,6 +7879,9 @@
             <w:pPr>
               <w:spacing w:before="50" w:after="50"/>
             </w:pPr>
+            <w:r>
+              <w:t>Anshul Ghogre</w:t>
+            </w:r>
           </w:p>
         </w:tc>
         <w:tc>
@@ -7826,6 +7899,9 @@
             <w:pPr>
               <w:spacing w:before="50" w:after="50"/>
             </w:pPr>
+            <w:r>
+              <w:t>Resolved 16/09/26: flag file or environment setting, any operator with shell access, effective on the next ticket (Docs/governance.md section 5).</w:t>
+            </w:r>
           </w:p>
         </w:tc>
       </w:tr>
@@ -7885,6 +7961,9 @@
             <w:pPr>
               <w:spacing w:before="50" w:after="50"/>
             </w:pPr>
+            <w:r>
+              <w:t>Anshul Ghogre</w:t>
+            </w:r>
           </w:p>
         </w:tc>
         <w:tc>
@@ -7901,6 +7980,9 @@
             <w:pPr>
               <w:spacing w:before="50" w:after="50"/>
             </w:pPr>
+            <w:r>
+              <w:t>Open at submission: PR-07 rubric exists; no scorer or sample size agreed.</w:t>
+            </w:r>
           </w:p>
         </w:tc>
       </w:tr>
@@ -7963,6 +8045,9 @@
             <w:pPr>
               <w:spacing w:before="50" w:after="50"/>
             </w:pPr>
+            <w:r>
+              <w:t>Anshul Ghogre, to ask Marcus Adeyemi</w:t>
+            </w:r>
           </w:p>
         </w:tc>
         <w:tc>
@@ -7979,6 +8064,9 @@
             <w:pPr>
               <w:spacing w:before="50" w:after="50"/>
             </w:pPr>
+            <w:r>
+              <w:t>Built as FR-12 (disclosure on every automated reply); confirm with the client before a pilot.</w:t>
+            </w:r>
           </w:p>
         </w:tc>
       </w:tr>
@@ -8116,6 +8204,9 @@
             <w:pPr>
               <w:spacing w:before="50" w:after="50"/>
             </w:pPr>
+            <w:r>
+              <w:t>Anshul Ghogre</w:t>
+            </w:r>
           </w:p>
         </w:tc>
         <w:tc>
@@ -8133,7 +8224,7 @@
               <w:spacing w:before="50" w:after="50"/>
             </w:pPr>
             <w:r>
-              <w:t>recorded as FR-18 in the Stage 5 revision log</w:t>
+              <w:t>Resolved 16/09/26: FR-18 built and rehearsed.</w:t>
             </w:r>
           </w:p>
         </w:tc>

</xml_diff>